<commit_message>
fix: auto-align Column 2 option letters and body text in TAB2 with dedicated sub-tab stops
</commit_message>
<xml_diff>
--- a/output/test_leader_output.docx
+++ b/output/test_leader_output.docx
@@ -180,9 +180,10 @@
       <w:pPr>
         <w:tabs>
           <w:tab w:val="left" w:pos="2517"/>
+          <w:tab w:val="left" w:pos="2942"/>
         </w:tabs>
         <w:spacing w:before="60" w:after="60"/>
-        <w:ind w:left="2517" w:hanging="2517"/>
+        <w:ind w:left="2942" w:hanging="2942"/>
         <w:rPr>
           <w:sz w:val="24"/>
         </w:rPr>
@@ -208,18 +209,26 @@
       </w:r>
       <w:r>
         <w:rPr>
-          <w:sz w:val="24"/>
-        </w:rPr>
-        <w:t xml:space="preserve"> helps you learn about different countries and their currencies.</w:t>
+          <w:b/>
+          <w:sz w:val="24"/>
+        </w:rPr>
+        <w:tab/>
+      </w:r>
+      <w:r>
+        <w:rPr>
+          <w:sz w:val="24"/>
+        </w:rPr>
+        <w:t>helps you learn about different countries and their currencies.</w:t>
       </w:r>
     </w:p>
     <w:p>
       <w:pPr>
         <w:tabs>
           <w:tab w:val="left" w:pos="2517"/>
+          <w:tab w:val="left" w:pos="2942"/>
         </w:tabs>
         <w:spacing w:before="60" w:after="60"/>
-        <w:ind w:left="2517" w:hanging="2517"/>
+        <w:ind w:left="2942" w:hanging="2942"/>
         <w:rPr>
           <w:sz w:val="24"/>
         </w:rPr>
@@ -245,18 +254,26 @@
       </w:r>
       <w:r>
         <w:rPr>
-          <w:sz w:val="24"/>
-        </w:rPr>
-        <w:t xml:space="preserve"> needs a pattern, a needle and threads.</w:t>
+          <w:b/>
+          <w:sz w:val="24"/>
+        </w:rPr>
+        <w:tab/>
+      </w:r>
+      <w:r>
+        <w:rPr>
+          <w:sz w:val="24"/>
+        </w:rPr>
+        <w:t>needs a pattern, a needle and threads.</w:t>
       </w:r>
     </w:p>
     <w:p>
       <w:pPr>
         <w:tabs>
           <w:tab w:val="left" w:pos="2109"/>
+          <w:tab w:val="left" w:pos="2534"/>
         </w:tabs>
         <w:spacing w:before="60" w:after="60"/>
-        <w:ind w:left="2109" w:hanging="2109"/>
+        <w:ind w:left="2534" w:hanging="2534"/>
         <w:rPr>
           <w:sz w:val="24"/>
         </w:rPr>
@@ -282,18 +299,26 @@
       </w:r>
       <w:r>
         <w:rPr>
-          <w:sz w:val="24"/>
-        </w:rPr>
-        <w:t xml:space="preserve"> is the process of cutting a piece of wood to make decorative objects.</w:t>
+          <w:b/>
+          <w:sz w:val="24"/>
+        </w:rPr>
+        <w:tab/>
+      </w:r>
+      <w:r>
+        <w:rPr>
+          <w:sz w:val="24"/>
+        </w:rPr>
+        <w:t>is the process of cutting a piece of wood to make decorative objects.</w:t>
       </w:r>
     </w:p>
     <w:p>
       <w:pPr>
         <w:tabs>
           <w:tab w:val="left" w:pos="2109"/>
+          <w:tab w:val="left" w:pos="2534"/>
         </w:tabs>
         <w:spacing w:before="60" w:after="60"/>
-        <w:ind w:left="2109" w:hanging="2109"/>
+        <w:ind w:left="2534" w:hanging="2534"/>
         <w:rPr>
           <w:sz w:val="24"/>
         </w:rPr>
@@ -319,18 +344,26 @@
       </w:r>
       <w:r>
         <w:rPr>
-          <w:sz w:val="24"/>
-        </w:rPr>
-        <w:t xml:space="preserve"> means making very small replicas of real objects.</w:t>
+          <w:b/>
+          <w:sz w:val="24"/>
+        </w:rPr>
+        <w:tab/>
+      </w:r>
+      <w:r>
+        <w:rPr>
+          <w:sz w:val="24"/>
+        </w:rPr>
+        <w:t>means making very small replicas of real objects.</w:t>
       </w:r>
     </w:p>
     <w:p>
       <w:pPr>
         <w:tabs>
           <w:tab w:val="left" w:pos="2109"/>
+          <w:tab w:val="left" w:pos="2534"/>
         </w:tabs>
         <w:spacing w:before="60" w:after="60"/>
-        <w:ind w:left="2109" w:hanging="2109"/>
+        <w:ind w:left="2534" w:hanging="2534"/>
         <w:rPr>
           <w:sz w:val="24"/>
         </w:rPr>
@@ -356,18 +389,26 @@
       </w:r>
       <w:r>
         <w:rPr>
-          <w:sz w:val="24"/>
-        </w:rPr>
-        <w:t xml:space="preserve"> is the practice of growing and cultivating plants.</w:t>
+          <w:b/>
+          <w:sz w:val="24"/>
+        </w:rPr>
+        <w:tab/>
+      </w:r>
+      <w:r>
+        <w:rPr>
+          <w:sz w:val="24"/>
+        </w:rPr>
+        <w:t>is the practice of growing and cultivating plants.</w:t>
       </w:r>
     </w:p>
     <w:p>
       <w:pPr>
         <w:tabs>
           <w:tab w:val="left" w:pos="1984"/>
+          <w:tab w:val="left" w:pos="2409"/>
         </w:tabs>
         <w:spacing w:before="60" w:after="60"/>
-        <w:ind w:left="1984" w:hanging="1984"/>
+        <w:ind w:left="2409" w:hanging="2409"/>
         <w:rPr>
           <w:sz w:val="24"/>
         </w:rPr>
@@ -393,9 +434,16 @@
       </w:r>
       <w:r>
         <w:rPr>
-          <w:sz w:val="24"/>
-        </w:rPr>
-        <w:t xml:space="preserve"> develops your imagination and widens your knowledge.</w:t>
+          <w:b/>
+          <w:sz w:val="24"/>
+        </w:rPr>
+        <w:tab/>
+      </w:r>
+      <w:r>
+        <w:rPr>
+          <w:sz w:val="24"/>
+        </w:rPr>
+        <w:t>develops your imagination and widens your knowledge.</w:t>
       </w:r>
     </w:p>
     <w:p>
@@ -1008,7 +1056,7 @@
     <w:link w:val="Heading1Char"/>
     <w:uiPriority w:val="9"/>
     <w:qFormat/>
-    <w:rsid w:val="0080617E"/>
+    <w:rsid w:val="008D7691"/>
     <w:pPr>
       <w:keepNext/>
       <w:keepLines/>
@@ -1031,7 +1079,7 @@
     <w:semiHidden/>
     <w:unhideWhenUsed/>
     <w:qFormat/>
-    <w:rsid w:val="0080617E"/>
+    <w:rsid w:val="008D7691"/>
     <w:pPr>
       <w:keepNext/>
       <w:keepLines/>
@@ -1054,7 +1102,7 @@
     <w:semiHidden/>
     <w:unhideWhenUsed/>
     <w:qFormat/>
-    <w:rsid w:val="0080617E"/>
+    <w:rsid w:val="008D7691"/>
     <w:pPr>
       <w:keepNext/>
       <w:keepLines/>
@@ -1077,7 +1125,7 @@
     <w:semiHidden/>
     <w:unhideWhenUsed/>
     <w:qFormat/>
-    <w:rsid w:val="0080617E"/>
+    <w:rsid w:val="008D7691"/>
     <w:pPr>
       <w:keepNext/>
       <w:keepLines/>
@@ -1100,7 +1148,7 @@
     <w:semiHidden/>
     <w:unhideWhenUsed/>
     <w:qFormat/>
-    <w:rsid w:val="0080617E"/>
+    <w:rsid w:val="008D7691"/>
     <w:pPr>
       <w:keepNext/>
       <w:keepLines/>
@@ -1121,7 +1169,7 @@
     <w:semiHidden/>
     <w:unhideWhenUsed/>
     <w:qFormat/>
-    <w:rsid w:val="0080617E"/>
+    <w:rsid w:val="008D7691"/>
     <w:pPr>
       <w:keepNext/>
       <w:keepLines/>
@@ -1144,7 +1192,7 @@
     <w:semiHidden/>
     <w:unhideWhenUsed/>
     <w:qFormat/>
-    <w:rsid w:val="0080617E"/>
+    <w:rsid w:val="008D7691"/>
     <w:pPr>
       <w:keepNext/>
       <w:keepLines/>
@@ -1165,7 +1213,7 @@
     <w:semiHidden/>
     <w:unhideWhenUsed/>
     <w:qFormat/>
-    <w:rsid w:val="0080617E"/>
+    <w:rsid w:val="008D7691"/>
     <w:pPr>
       <w:keepNext/>
       <w:keepLines/>
@@ -1188,7 +1236,7 @@
     <w:semiHidden/>
     <w:unhideWhenUsed/>
     <w:qFormat/>
-    <w:rsid w:val="0080617E"/>
+    <w:rsid w:val="008D7691"/>
     <w:pPr>
       <w:keepNext/>
       <w:keepLines/>
@@ -1232,7 +1280,7 @@
     <w:basedOn w:val="DefaultParagraphFont"/>
     <w:link w:val="Heading1"/>
     <w:uiPriority w:val="9"/>
-    <w:rsid w:val="0080617E"/>
+    <w:rsid w:val="008D7691"/>
     <w:rPr>
       <w:rFonts w:asciiTheme="majorHAnsi" w:eastAsiaTheme="majorEastAsia" w:hAnsiTheme="majorHAnsi" w:cstheme="majorBidi"/>
       <w:color w:val="0F4761" w:themeColor="accent1" w:themeShade="BF"/>
@@ -1246,7 +1294,7 @@
     <w:link w:val="Heading2"/>
     <w:uiPriority w:val="9"/>
     <w:semiHidden/>
-    <w:rsid w:val="0080617E"/>
+    <w:rsid w:val="008D7691"/>
     <w:rPr>
       <w:rFonts w:asciiTheme="majorHAnsi" w:eastAsiaTheme="majorEastAsia" w:hAnsiTheme="majorHAnsi" w:cstheme="majorBidi"/>
       <w:color w:val="0F4761" w:themeColor="accent1" w:themeShade="BF"/>
@@ -1260,7 +1308,7 @@
     <w:link w:val="Heading3"/>
     <w:uiPriority w:val="9"/>
     <w:semiHidden/>
-    <w:rsid w:val="0080617E"/>
+    <w:rsid w:val="008D7691"/>
     <w:rPr>
       <w:rFonts w:asciiTheme="minorHAnsi" w:eastAsiaTheme="majorEastAsia" w:hAnsiTheme="minorHAnsi" w:cstheme="majorBidi"/>
       <w:color w:val="0F4761" w:themeColor="accent1" w:themeShade="BF"/>
@@ -1274,7 +1322,7 @@
     <w:link w:val="Heading4"/>
     <w:uiPriority w:val="9"/>
     <w:semiHidden/>
-    <w:rsid w:val="0080617E"/>
+    <w:rsid w:val="008D7691"/>
     <w:rPr>
       <w:rFonts w:asciiTheme="minorHAnsi" w:eastAsiaTheme="majorEastAsia" w:hAnsiTheme="minorHAnsi" w:cstheme="majorBidi"/>
       <w:i/>
@@ -1288,7 +1336,7 @@
     <w:link w:val="Heading5"/>
     <w:uiPriority w:val="9"/>
     <w:semiHidden/>
-    <w:rsid w:val="0080617E"/>
+    <w:rsid w:val="008D7691"/>
     <w:rPr>
       <w:rFonts w:asciiTheme="minorHAnsi" w:eastAsiaTheme="majorEastAsia" w:hAnsiTheme="minorHAnsi" w:cstheme="majorBidi"/>
       <w:color w:val="0F4761" w:themeColor="accent1" w:themeShade="BF"/>
@@ -1300,7 +1348,7 @@
     <w:link w:val="Heading6"/>
     <w:uiPriority w:val="9"/>
     <w:semiHidden/>
-    <w:rsid w:val="0080617E"/>
+    <w:rsid w:val="008D7691"/>
     <w:rPr>
       <w:rFonts w:asciiTheme="minorHAnsi" w:eastAsiaTheme="majorEastAsia" w:hAnsiTheme="minorHAnsi" w:cstheme="majorBidi"/>
       <w:i/>
@@ -1314,7 +1362,7 @@
     <w:link w:val="Heading7"/>
     <w:uiPriority w:val="9"/>
     <w:semiHidden/>
-    <w:rsid w:val="0080617E"/>
+    <w:rsid w:val="008D7691"/>
     <w:rPr>
       <w:rFonts w:asciiTheme="minorHAnsi" w:eastAsiaTheme="majorEastAsia" w:hAnsiTheme="minorHAnsi" w:cstheme="majorBidi"/>
       <w:color w:val="595959" w:themeColor="text1" w:themeTint="A6"/>
@@ -1326,7 +1374,7 @@
     <w:link w:val="Heading8"/>
     <w:uiPriority w:val="9"/>
     <w:semiHidden/>
-    <w:rsid w:val="0080617E"/>
+    <w:rsid w:val="008D7691"/>
     <w:rPr>
       <w:rFonts w:asciiTheme="minorHAnsi" w:eastAsiaTheme="majorEastAsia" w:hAnsiTheme="minorHAnsi" w:cstheme="majorBidi"/>
       <w:i/>
@@ -1340,7 +1388,7 @@
     <w:link w:val="Heading9"/>
     <w:uiPriority w:val="9"/>
     <w:semiHidden/>
-    <w:rsid w:val="0080617E"/>
+    <w:rsid w:val="008D7691"/>
     <w:rPr>
       <w:rFonts w:asciiTheme="minorHAnsi" w:eastAsiaTheme="majorEastAsia" w:hAnsiTheme="minorHAnsi" w:cstheme="majorBidi"/>
       <w:color w:val="272727" w:themeColor="text1" w:themeTint="D8"/>
@@ -1353,7 +1401,7 @@
     <w:link w:val="TitleChar"/>
     <w:uiPriority w:val="10"/>
     <w:qFormat/>
-    <w:rsid w:val="0080617E"/>
+    <w:rsid w:val="008D7691"/>
     <w:pPr>
       <w:spacing w:after="80" w:line="240" w:lineRule="auto"/>
       <w:contextualSpacing/>
@@ -1371,7 +1419,7 @@
     <w:basedOn w:val="DefaultParagraphFont"/>
     <w:link w:val="Title"/>
     <w:uiPriority w:val="10"/>
-    <w:rsid w:val="0080617E"/>
+    <w:rsid w:val="008D7691"/>
     <w:rPr>
       <w:rFonts w:asciiTheme="majorHAnsi" w:eastAsiaTheme="majorEastAsia" w:hAnsiTheme="majorHAnsi" w:cstheme="majorBidi"/>
       <w:spacing w:val="-10"/>
@@ -1387,7 +1435,7 @@
     <w:link w:val="SubtitleChar"/>
     <w:uiPriority w:val="11"/>
     <w:qFormat/>
-    <w:rsid w:val="0080617E"/>
+    <w:rsid w:val="008D7691"/>
     <w:pPr>
       <w:numPr>
         <w:ilvl w:val="1"/>
@@ -1406,7 +1454,7 @@
     <w:basedOn w:val="DefaultParagraphFont"/>
     <w:link w:val="Subtitle"/>
     <w:uiPriority w:val="11"/>
-    <w:rsid w:val="0080617E"/>
+    <w:rsid w:val="008D7691"/>
     <w:rPr>
       <w:rFonts w:asciiTheme="minorHAnsi" w:eastAsiaTheme="majorEastAsia" w:hAnsiTheme="minorHAnsi" w:cstheme="majorBidi"/>
       <w:color w:val="595959" w:themeColor="text1" w:themeTint="A6"/>
@@ -1422,7 +1470,7 @@
     <w:link w:val="QuoteChar"/>
     <w:uiPriority w:val="29"/>
     <w:qFormat/>
-    <w:rsid w:val="0080617E"/>
+    <w:rsid w:val="008D7691"/>
     <w:pPr>
       <w:spacing w:before="160"/>
       <w:jc w:val="center"/>
@@ -1438,7 +1486,7 @@
     <w:basedOn w:val="DefaultParagraphFont"/>
     <w:link w:val="Quote"/>
     <w:uiPriority w:val="29"/>
-    <w:rsid w:val="0080617E"/>
+    <w:rsid w:val="008D7691"/>
     <w:rPr>
       <w:i/>
       <w:iCs/>
@@ -1450,7 +1498,7 @@
     <w:basedOn w:val="Normal"/>
     <w:uiPriority w:val="34"/>
     <w:qFormat/>
-    <w:rsid w:val="0080617E"/>
+    <w:rsid w:val="008D7691"/>
     <w:pPr>
       <w:ind w:left="720"/>
       <w:contextualSpacing/>
@@ -1461,7 +1509,7 @@
     <w:basedOn w:val="DefaultParagraphFont"/>
     <w:uiPriority w:val="21"/>
     <w:qFormat/>
-    <w:rsid w:val="0080617E"/>
+    <w:rsid w:val="008D7691"/>
     <w:rPr>
       <w:i/>
       <w:iCs/>
@@ -1475,7 +1523,7 @@
     <w:link w:val="IntenseQuoteChar"/>
     <w:uiPriority w:val="30"/>
     <w:qFormat/>
-    <w:rsid w:val="0080617E"/>
+    <w:rsid w:val="008D7691"/>
     <w:pPr>
       <w:pBdr>
         <w:top w:val="single" w:sz="4" w:space="10" w:color="0F4761" w:themeColor="accent1" w:themeShade="BF"/>
@@ -1496,7 +1544,7 @@
     <w:basedOn w:val="DefaultParagraphFont"/>
     <w:link w:val="IntenseQuote"/>
     <w:uiPriority w:val="30"/>
-    <w:rsid w:val="0080617E"/>
+    <w:rsid w:val="008D7691"/>
     <w:rPr>
       <w:i/>
       <w:iCs/>
@@ -1508,7 +1556,7 @@
     <w:basedOn w:val="DefaultParagraphFont"/>
     <w:uiPriority w:val="32"/>
     <w:qFormat/>
-    <w:rsid w:val="0080617E"/>
+    <w:rsid w:val="008D7691"/>
     <w:rPr>
       <w:b/>
       <w:bCs/>
@@ -1523,7 +1571,7 @@
     <w:link w:val="HeaderChar"/>
     <w:uiPriority w:val="99"/>
     <w:unhideWhenUsed/>
-    <w:rsid w:val="0080617E"/>
+    <w:rsid w:val="008D7691"/>
     <w:pPr>
       <w:tabs>
         <w:tab w:val="center" w:pos="4680"/>
@@ -1537,7 +1585,7 @@
     <w:basedOn w:val="DefaultParagraphFont"/>
     <w:link w:val="Header"/>
     <w:uiPriority w:val="99"/>
-    <w:rsid w:val="0080617E"/>
+    <w:rsid w:val="008D7691"/>
   </w:style>
   <w:style w:type="paragraph" w:styleId="Footer">
     <w:name w:val="footer"/>
@@ -1545,7 +1593,7 @@
     <w:link w:val="FooterChar"/>
     <w:uiPriority w:val="99"/>
     <w:unhideWhenUsed/>
-    <w:rsid w:val="0080617E"/>
+    <w:rsid w:val="008D7691"/>
     <w:pPr>
       <w:tabs>
         <w:tab w:val="center" w:pos="4680"/>
@@ -1559,7 +1607,7 @@
     <w:basedOn w:val="DefaultParagraphFont"/>
     <w:link w:val="Footer"/>
     <w:uiPriority w:val="99"/>
-    <w:rsid w:val="0080617E"/>
+    <w:rsid w:val="008D7691"/>
   </w:style>
 </w:styles>
 </file>

</xml_diff>

<commit_message>
fix: compute TAB2 base_indent_cm across group to ensure 100% Column 2 vertical alignment
</commit_message>
<xml_diff>
--- a/output/test_leader_output.docx
+++ b/output/test_leader_output.docx
@@ -1056,7 +1056,7 @@
     <w:link w:val="Heading1Char"/>
     <w:uiPriority w:val="9"/>
     <w:qFormat/>
-    <w:rsid w:val="008D7691"/>
+    <w:rsid w:val="004E6C8E"/>
     <w:pPr>
       <w:keepNext/>
       <w:keepLines/>
@@ -1079,7 +1079,7 @@
     <w:semiHidden/>
     <w:unhideWhenUsed/>
     <w:qFormat/>
-    <w:rsid w:val="008D7691"/>
+    <w:rsid w:val="004E6C8E"/>
     <w:pPr>
       <w:keepNext/>
       <w:keepLines/>
@@ -1102,7 +1102,7 @@
     <w:semiHidden/>
     <w:unhideWhenUsed/>
     <w:qFormat/>
-    <w:rsid w:val="008D7691"/>
+    <w:rsid w:val="004E6C8E"/>
     <w:pPr>
       <w:keepNext/>
       <w:keepLines/>
@@ -1125,7 +1125,7 @@
     <w:semiHidden/>
     <w:unhideWhenUsed/>
     <w:qFormat/>
-    <w:rsid w:val="008D7691"/>
+    <w:rsid w:val="004E6C8E"/>
     <w:pPr>
       <w:keepNext/>
       <w:keepLines/>
@@ -1148,7 +1148,7 @@
     <w:semiHidden/>
     <w:unhideWhenUsed/>
     <w:qFormat/>
-    <w:rsid w:val="008D7691"/>
+    <w:rsid w:val="004E6C8E"/>
     <w:pPr>
       <w:keepNext/>
       <w:keepLines/>
@@ -1169,7 +1169,7 @@
     <w:semiHidden/>
     <w:unhideWhenUsed/>
     <w:qFormat/>
-    <w:rsid w:val="008D7691"/>
+    <w:rsid w:val="004E6C8E"/>
     <w:pPr>
       <w:keepNext/>
       <w:keepLines/>
@@ -1192,7 +1192,7 @@
     <w:semiHidden/>
     <w:unhideWhenUsed/>
     <w:qFormat/>
-    <w:rsid w:val="008D7691"/>
+    <w:rsid w:val="004E6C8E"/>
     <w:pPr>
       <w:keepNext/>
       <w:keepLines/>
@@ -1213,7 +1213,7 @@
     <w:semiHidden/>
     <w:unhideWhenUsed/>
     <w:qFormat/>
-    <w:rsid w:val="008D7691"/>
+    <w:rsid w:val="004E6C8E"/>
     <w:pPr>
       <w:keepNext/>
       <w:keepLines/>
@@ -1236,7 +1236,7 @@
     <w:semiHidden/>
     <w:unhideWhenUsed/>
     <w:qFormat/>
-    <w:rsid w:val="008D7691"/>
+    <w:rsid w:val="004E6C8E"/>
     <w:pPr>
       <w:keepNext/>
       <w:keepLines/>
@@ -1280,7 +1280,7 @@
     <w:basedOn w:val="DefaultParagraphFont"/>
     <w:link w:val="Heading1"/>
     <w:uiPriority w:val="9"/>
-    <w:rsid w:val="008D7691"/>
+    <w:rsid w:val="004E6C8E"/>
     <w:rPr>
       <w:rFonts w:asciiTheme="majorHAnsi" w:eastAsiaTheme="majorEastAsia" w:hAnsiTheme="majorHAnsi" w:cstheme="majorBidi"/>
       <w:color w:val="0F4761" w:themeColor="accent1" w:themeShade="BF"/>
@@ -1294,7 +1294,7 @@
     <w:link w:val="Heading2"/>
     <w:uiPriority w:val="9"/>
     <w:semiHidden/>
-    <w:rsid w:val="008D7691"/>
+    <w:rsid w:val="004E6C8E"/>
     <w:rPr>
       <w:rFonts w:asciiTheme="majorHAnsi" w:eastAsiaTheme="majorEastAsia" w:hAnsiTheme="majorHAnsi" w:cstheme="majorBidi"/>
       <w:color w:val="0F4761" w:themeColor="accent1" w:themeShade="BF"/>
@@ -1308,7 +1308,7 @@
     <w:link w:val="Heading3"/>
     <w:uiPriority w:val="9"/>
     <w:semiHidden/>
-    <w:rsid w:val="008D7691"/>
+    <w:rsid w:val="004E6C8E"/>
     <w:rPr>
       <w:rFonts w:asciiTheme="minorHAnsi" w:eastAsiaTheme="majorEastAsia" w:hAnsiTheme="minorHAnsi" w:cstheme="majorBidi"/>
       <w:color w:val="0F4761" w:themeColor="accent1" w:themeShade="BF"/>
@@ -1322,7 +1322,7 @@
     <w:link w:val="Heading4"/>
     <w:uiPriority w:val="9"/>
     <w:semiHidden/>
-    <w:rsid w:val="008D7691"/>
+    <w:rsid w:val="004E6C8E"/>
     <w:rPr>
       <w:rFonts w:asciiTheme="minorHAnsi" w:eastAsiaTheme="majorEastAsia" w:hAnsiTheme="minorHAnsi" w:cstheme="majorBidi"/>
       <w:i/>
@@ -1336,7 +1336,7 @@
     <w:link w:val="Heading5"/>
     <w:uiPriority w:val="9"/>
     <w:semiHidden/>
-    <w:rsid w:val="008D7691"/>
+    <w:rsid w:val="004E6C8E"/>
     <w:rPr>
       <w:rFonts w:asciiTheme="minorHAnsi" w:eastAsiaTheme="majorEastAsia" w:hAnsiTheme="minorHAnsi" w:cstheme="majorBidi"/>
       <w:color w:val="0F4761" w:themeColor="accent1" w:themeShade="BF"/>
@@ -1348,7 +1348,7 @@
     <w:link w:val="Heading6"/>
     <w:uiPriority w:val="9"/>
     <w:semiHidden/>
-    <w:rsid w:val="008D7691"/>
+    <w:rsid w:val="004E6C8E"/>
     <w:rPr>
       <w:rFonts w:asciiTheme="minorHAnsi" w:eastAsiaTheme="majorEastAsia" w:hAnsiTheme="minorHAnsi" w:cstheme="majorBidi"/>
       <w:i/>
@@ -1362,7 +1362,7 @@
     <w:link w:val="Heading7"/>
     <w:uiPriority w:val="9"/>
     <w:semiHidden/>
-    <w:rsid w:val="008D7691"/>
+    <w:rsid w:val="004E6C8E"/>
     <w:rPr>
       <w:rFonts w:asciiTheme="minorHAnsi" w:eastAsiaTheme="majorEastAsia" w:hAnsiTheme="minorHAnsi" w:cstheme="majorBidi"/>
       <w:color w:val="595959" w:themeColor="text1" w:themeTint="A6"/>
@@ -1374,7 +1374,7 @@
     <w:link w:val="Heading8"/>
     <w:uiPriority w:val="9"/>
     <w:semiHidden/>
-    <w:rsid w:val="008D7691"/>
+    <w:rsid w:val="004E6C8E"/>
     <w:rPr>
       <w:rFonts w:asciiTheme="minorHAnsi" w:eastAsiaTheme="majorEastAsia" w:hAnsiTheme="minorHAnsi" w:cstheme="majorBidi"/>
       <w:i/>
@@ -1388,7 +1388,7 @@
     <w:link w:val="Heading9"/>
     <w:uiPriority w:val="9"/>
     <w:semiHidden/>
-    <w:rsid w:val="008D7691"/>
+    <w:rsid w:val="004E6C8E"/>
     <w:rPr>
       <w:rFonts w:asciiTheme="minorHAnsi" w:eastAsiaTheme="majorEastAsia" w:hAnsiTheme="minorHAnsi" w:cstheme="majorBidi"/>
       <w:color w:val="272727" w:themeColor="text1" w:themeTint="D8"/>
@@ -1401,7 +1401,7 @@
     <w:link w:val="TitleChar"/>
     <w:uiPriority w:val="10"/>
     <w:qFormat/>
-    <w:rsid w:val="008D7691"/>
+    <w:rsid w:val="004E6C8E"/>
     <w:pPr>
       <w:spacing w:after="80" w:line="240" w:lineRule="auto"/>
       <w:contextualSpacing/>
@@ -1419,7 +1419,7 @@
     <w:basedOn w:val="DefaultParagraphFont"/>
     <w:link w:val="Title"/>
     <w:uiPriority w:val="10"/>
-    <w:rsid w:val="008D7691"/>
+    <w:rsid w:val="004E6C8E"/>
     <w:rPr>
       <w:rFonts w:asciiTheme="majorHAnsi" w:eastAsiaTheme="majorEastAsia" w:hAnsiTheme="majorHAnsi" w:cstheme="majorBidi"/>
       <w:spacing w:val="-10"/>
@@ -1435,7 +1435,7 @@
     <w:link w:val="SubtitleChar"/>
     <w:uiPriority w:val="11"/>
     <w:qFormat/>
-    <w:rsid w:val="008D7691"/>
+    <w:rsid w:val="004E6C8E"/>
     <w:pPr>
       <w:numPr>
         <w:ilvl w:val="1"/>
@@ -1454,7 +1454,7 @@
     <w:basedOn w:val="DefaultParagraphFont"/>
     <w:link w:val="Subtitle"/>
     <w:uiPriority w:val="11"/>
-    <w:rsid w:val="008D7691"/>
+    <w:rsid w:val="004E6C8E"/>
     <w:rPr>
       <w:rFonts w:asciiTheme="minorHAnsi" w:eastAsiaTheme="majorEastAsia" w:hAnsiTheme="minorHAnsi" w:cstheme="majorBidi"/>
       <w:color w:val="595959" w:themeColor="text1" w:themeTint="A6"/>
@@ -1470,7 +1470,7 @@
     <w:link w:val="QuoteChar"/>
     <w:uiPriority w:val="29"/>
     <w:qFormat/>
-    <w:rsid w:val="008D7691"/>
+    <w:rsid w:val="004E6C8E"/>
     <w:pPr>
       <w:spacing w:before="160"/>
       <w:jc w:val="center"/>
@@ -1486,7 +1486,7 @@
     <w:basedOn w:val="DefaultParagraphFont"/>
     <w:link w:val="Quote"/>
     <w:uiPriority w:val="29"/>
-    <w:rsid w:val="008D7691"/>
+    <w:rsid w:val="004E6C8E"/>
     <w:rPr>
       <w:i/>
       <w:iCs/>
@@ -1498,7 +1498,7 @@
     <w:basedOn w:val="Normal"/>
     <w:uiPriority w:val="34"/>
     <w:qFormat/>
-    <w:rsid w:val="008D7691"/>
+    <w:rsid w:val="004E6C8E"/>
     <w:pPr>
       <w:ind w:left="720"/>
       <w:contextualSpacing/>
@@ -1509,7 +1509,7 @@
     <w:basedOn w:val="DefaultParagraphFont"/>
     <w:uiPriority w:val="21"/>
     <w:qFormat/>
-    <w:rsid w:val="008D7691"/>
+    <w:rsid w:val="004E6C8E"/>
     <w:rPr>
       <w:i/>
       <w:iCs/>
@@ -1523,7 +1523,7 @@
     <w:link w:val="IntenseQuoteChar"/>
     <w:uiPriority w:val="30"/>
     <w:qFormat/>
-    <w:rsid w:val="008D7691"/>
+    <w:rsid w:val="004E6C8E"/>
     <w:pPr>
       <w:pBdr>
         <w:top w:val="single" w:sz="4" w:space="10" w:color="0F4761" w:themeColor="accent1" w:themeShade="BF"/>
@@ -1544,7 +1544,7 @@
     <w:basedOn w:val="DefaultParagraphFont"/>
     <w:link w:val="IntenseQuote"/>
     <w:uiPriority w:val="30"/>
-    <w:rsid w:val="008D7691"/>
+    <w:rsid w:val="004E6C8E"/>
     <w:rPr>
       <w:i/>
       <w:iCs/>
@@ -1556,7 +1556,7 @@
     <w:basedOn w:val="DefaultParagraphFont"/>
     <w:uiPriority w:val="32"/>
     <w:qFormat/>
-    <w:rsid w:val="008D7691"/>
+    <w:rsid w:val="004E6C8E"/>
     <w:rPr>
       <w:b/>
       <w:bCs/>
@@ -1571,7 +1571,7 @@
     <w:link w:val="HeaderChar"/>
     <w:uiPriority w:val="99"/>
     <w:unhideWhenUsed/>
-    <w:rsid w:val="008D7691"/>
+    <w:rsid w:val="004E6C8E"/>
     <w:pPr>
       <w:tabs>
         <w:tab w:val="center" w:pos="4680"/>
@@ -1585,7 +1585,7 @@
     <w:basedOn w:val="DefaultParagraphFont"/>
     <w:link w:val="Header"/>
     <w:uiPriority w:val="99"/>
-    <w:rsid w:val="008D7691"/>
+    <w:rsid w:val="004E6C8E"/>
   </w:style>
   <w:style w:type="paragraph" w:styleId="Footer">
     <w:name w:val="footer"/>
@@ -1593,7 +1593,7 @@
     <w:link w:val="FooterChar"/>
     <w:uiPriority w:val="99"/>
     <w:unhideWhenUsed/>
-    <w:rsid w:val="008D7691"/>
+    <w:rsid w:val="004E6C8E"/>
     <w:pPr>
       <w:tabs>
         <w:tab w:val="center" w:pos="4680"/>
@@ -1607,7 +1607,7 @@
     <w:basedOn w:val="DefaultParagraphFont"/>
     <w:link w:val="Footer"/>
     <w:uiPriority w:val="99"/>
-    <w:rsid w:val="008D7691"/>
+    <w:rsid w:val="004E6C8E"/>
   </w:style>
 </w:styles>
 </file>

</xml_diff>